<commit_message>
fix(canon): dong bo nhat quan chuc danh Giam Doc Ky Thuat Du Lieu cho Minh An tu ch59-ch66
</commit_message>
<xml_diff>
--- a/manuscript/word/volume_01/arc_02/ch_059.docx
+++ b/manuscript/word/volume_01/arc_02/ch_059.docx
@@ -15,7 +15,7 @@
         </w:rPr>
         <w:t>PHÁ TRỜI</w:t>
         <w:br/>
-        <w:t>CHƯƠNG 59: TRẬN ĐỒ MƯỜI HAI CHỐT CHẶN</w:t>
+        <w:t>CHƯƠNG 59</w:t>
       </w:r>
     </w:p>
     <w:p>
@@ -45,6 +45,141 @@
           <w:color w:val="141414"/>
           <w:sz w:val="24"/>
         </w:rPr>
+        <w:t>---</w:t>
+      </w:r>
+    </w:p>
+    <w:p>
+      <w:pPr>
+        <w:spacing w:line="300" w:lineRule="auto" w:after="120"/>
+        <w:ind w:firstLine="432"/>
+        <w:jc w:val="both"/>
+      </w:pPr>
+      <w:r>
+        <w:rPr>
+          <w:rFonts w:ascii="Times New Roman" w:hAnsi="Times New Roman"/>
+          <w:color w:val="141414"/>
+          <w:sz w:val="24"/>
+        </w:rPr>
+        <w:t>chapter: 59</w:t>
+      </w:r>
+    </w:p>
+    <w:p>
+      <w:pPr>
+        <w:spacing w:line="300" w:lineRule="auto" w:after="120"/>
+        <w:ind w:firstLine="432"/>
+        <w:jc w:val="both"/>
+      </w:pPr>
+      <w:r>
+        <w:rPr>
+          <w:rFonts w:ascii="Times New Roman" w:hAnsi="Times New Roman"/>
+          <w:color w:val="141414"/>
+          <w:sz w:val="24"/>
+        </w:rPr>
+        <w:t>title: "Trận Đồ Mười Hai Chốt Chặn"</w:t>
+      </w:r>
+    </w:p>
+    <w:p>
+      <w:pPr>
+        <w:spacing w:line="300" w:lineRule="auto" w:after="120"/>
+        <w:ind w:firstLine="432"/>
+        <w:jc w:val="both"/>
+      </w:pPr>
+      <w:r>
+        <w:rPr>
+          <w:rFonts w:ascii="Times New Roman" w:hAnsi="Times New Roman"/>
+          <w:color w:val="141414"/>
+          <w:sz w:val="24"/>
+        </w:rPr>
+        <w:t>volume: 1</w:t>
+      </w:r>
+    </w:p>
+    <w:p>
+      <w:pPr>
+        <w:spacing w:line="300" w:lineRule="auto" w:after="120"/>
+        <w:ind w:firstLine="432"/>
+        <w:jc w:val="both"/>
+      </w:pPr>
+      <w:r>
+        <w:rPr>
+          <w:rFonts w:ascii="Times New Roman" w:hAnsi="Times New Roman"/>
+          <w:color w:val="141414"/>
+          <w:sz w:val="24"/>
+        </w:rPr>
+        <w:t>arc: 2</w:t>
+      </w:r>
+    </w:p>
+    <w:p>
+      <w:pPr>
+        <w:spacing w:line="300" w:lineRule="auto" w:after="120"/>
+        <w:ind w:firstLine="432"/>
+        <w:jc w:val="both"/>
+      </w:pPr>
+      <w:r>
+        <w:rPr>
+          <w:rFonts w:ascii="Times New Roman" w:hAnsi="Times New Roman"/>
+          <w:color w:val="141414"/>
+          <w:sz w:val="24"/>
+        </w:rPr>
+        <w:t>word_count: 3432</w:t>
+      </w:r>
+    </w:p>
+    <w:p>
+      <w:pPr>
+        <w:spacing w:line="300" w:lineRule="auto" w:after="120"/>
+        <w:ind w:firstLine="432"/>
+        <w:jc w:val="both"/>
+      </w:pPr>
+      <w:r>
+        <w:rPr>
+          <w:rFonts w:ascii="Times New Roman" w:hAnsi="Times New Roman"/>
+          <w:color w:val="141414"/>
+          <w:sz w:val="24"/>
+        </w:rPr>
+        <w:t>date: "2026-10-18"</w:t>
+      </w:r>
+    </w:p>
+    <w:p>
+      <w:pPr>
+        <w:spacing w:line="300" w:lineRule="auto" w:after="120"/>
+        <w:ind w:firstLine="432"/>
+        <w:jc w:val="both"/>
+      </w:pPr>
+      <w:r>
+        <w:rPr>
+          <w:rFonts w:ascii="Times New Roman" w:hAnsi="Times New Roman"/>
+          <w:color w:val="141414"/>
+          <w:sz w:val="24"/>
+        </w:rPr>
+        <w:t>location: "Phường 7, Quận 6 &amp; Phòng trọ Nơ Trang Long, Bình Thạnh, TP.HCM"</w:t>
+      </w:r>
+    </w:p>
+    <w:p>
+      <w:pPr>
+        <w:spacing w:line="300" w:lineRule="auto" w:after="120"/>
+        <w:ind w:firstLine="432"/>
+        <w:jc w:val="both"/>
+      </w:pPr>
+      <w:r>
+        <w:rPr>
+          <w:rFonts w:ascii="Times New Roman" w:hAnsi="Times New Roman"/>
+          <w:color w:val="141414"/>
+          <w:sz w:val="24"/>
+        </w:rPr>
+        <w:t>---</w:t>
+      </w:r>
+    </w:p>
+    <w:p>
+      <w:pPr>
+        <w:spacing w:line="300" w:lineRule="auto" w:after="120"/>
+        <w:ind w:firstLine="432"/>
+        <w:jc w:val="both"/>
+      </w:pPr>
+      <w:r>
+        <w:rPr>
+          <w:rFonts w:ascii="Times New Roman" w:hAnsi="Times New Roman"/>
+          <w:color w:val="141414"/>
+          <w:sz w:val="24"/>
+        </w:rPr>
         <w:t>Mười chín giờ bốn mươi phút tối.</w:t>
       </w:r>
     </w:p>
@@ -1035,7 +1170,7 @@
           <w:color w:val="141414"/>
           <w:sz w:val="24"/>
         </w:rPr>
-        <w:t>Nhưng nếu tôi báo cảnh sát theo cách thông thường, thân phận của tôi sẽ lập tức bị lộ diện. Một chuyên viên kỹ thuật dữ liệu của Viện Địa tầng xuất hiện tại xưởng cơ khí lậu lúc tám giờ tối, hạ gục năm tên giang hồ bằng tay không và nắm giữ cổ vật... điều đó sẽ dẫn tới hàng loạt cuộc điều tra hành chính và thẩm vấn an ninh, phá vỡ hoàn toàn vỏ bọc bình thường mà tôi đang dày công bảo vệ.</w:t>
+        <w:t>Nhưng nếu tôi báo cảnh sát theo cách thông thường, thân phận của tôi sẽ lập tức bị lộ diện. Một Giám đốc Kỹ thuật Dữ liệu của Viện Địa tầng xuất hiện tại xưởng cơ khí lậu lúc tám giờ tối, hạ gục năm tên giang hồ bằng tay không và nắm giữ cổ vật... điều đó sẽ dẫn tới hàng loạt cuộc điều tra hành chính và thẩm vấn an ninh, phá vỡ hoàn toàn vỏ bọc bình thường mà tôi đang dày công bảo vệ.</w:t>
       </w:r>
     </w:p>
     <w:p>

</xml_diff>